<commit_message>
Clean paper artifacts and refine current draft
</commit_message>
<xml_diff>
--- a/paper_detailed.docx
+++ b/paper_detailed.docx
@@ -89,7 +89,7 @@
           <w:i w:val="0"/>
           <w:sz w:val="20"/>
         </w:rPr>
-        <w:t>반도체 EDS(Electrical Die Sorting) Test 결과인 Failbit Map은 천만 픽셀 이상의 표현력으로 웨이퍼 불량의 위치·분포·밀집도·방향성을 담는 수율 관리의 핵심 데이터이나, 기존 운영 환경은 수치 임계치 기반 사후 확인 구조에 머물러 맵 상의 공간적 이상 패턴을 조기에 탐지할 수 없는 구조적 한계를 지닌다. 본 논문은 이를 해결하기 위해 데이터 생성, 등록 불량 분류, 미등록 불량 군집화, UI 기반 전문가 검토를 단일 흐름으로 통합하는 도메인 지식 기반 파이프라인을 제안한다. 데이터 표현 계층에서는 Failbit Map이 전기적 검사 결과를 의미하는 약 20종의 이산 색상만 사용함을 활용하여 32-color palette-indexed PNG 포맷을 채택함으로써 무손실 의미 보존과 24-bit RGB 대비 65% 파일 크기 절감을 동시에 달성하였다. 등록 불량 분류 경로에서는 FCMAE 비지도 사전학습 가중치를 보유한 ConvNeXtV2-Base를 backbone으로 선택하고 Optuna 기반 전역 하이퍼파라미터 탐색을 적용하여 16-class weighted F1을 0.78에서 0.92로 향상시켰다. 나아가 low-confidence 및 difficult class에 한해 Grad-CAM 기반 동적 ROI 추출, 클래스별 spatial prior α-블렌딩, YOLO cls_loss 강화 이차 검증을 선택적으로 조합하는 2-stage correction 구조를 도입하여 최종 weighted F1 0.95를 달성하였다. 미등록 불량 경로에서는 Supervised Contrastive Learning 대비 open-set 임베딩 분리도가 우수한 InfoNCE 손실 함수를 채택하고, 웨이퍼 내 공간 위치가 공정 의미를 가진다는 도메인 지식을 반영한 grid36 structured local sampling과 HDBSCAN 밀도 기반 군집화를 결합하여 unknown defect 후보를 자동 탐지하고 전문가 검토 기반 라벨 확장 루프를 구성하였다.</w:t>
+        <w:t>반도체 EDS(Electrical Die Sorting) Test 결과인 Failbit Map은 천만 픽셀 이상의 표현력으로 웨이퍼 불량의 위치·분포·밀집도·방향성을 담는 수율 관리의 핵심 데이터이나, 기존 운영 환경은 수치 임계치 기반 사후 확인 구조에 머물러 맵 상의 공간적 이상 패턴을 조기에 탐지할 수 없는 구조적 한계를 지닌다. 본 논문은 이를 해결하기 위해 데이터 생성, 등록 불량 분류, 미등록 불량 군집화, UI 기반 전문가 검토를 단일 흐름으로 통합하는 도메인 지식 기반 파이프라인을 제안한다. 데이터 표현 계층에서는 Failbit Map이 전기적 검사 결과를 의미하는 약 20종의 이산 색상만 사용함을 활용하여 32-color palette-indexed PNG 포맷을 채택함으로써 무손실 의미 보존과 24-bit RGB 대비 65% 파일 크기 절감을 동시에 달성하였다. 등록 불량 분류 경로에서는 ConvNeXt V2 논문에서 제안된 FCMAE(Fully Convolutional Masked Autoencoder) 기반 사전학습 가중치를 사용하는 ConvNeXtV2-Base를 backbone으로 선택하고 Optuna 기반 전역 하이퍼파라미터 탐색을 적용하여 16-class weighted F1을 0.78에서 0.92로 향상시켰다. 나아가 low-confidence 및 difficult class에 한해 Grad-CAM 기반 동적 ROI 추출, 클래스별 spatial prior α-블렌딩, YOLO cls_loss 강화 이차 검증을 선택적으로 조합하는 2-stage correction 구조를 도입하여 최종 weighted F1 0.95를 달성하였다. 미등록 불량 경로에서는 Supervised Contrastive Learning 대비 open-set 임베딩 분리도가 우수한 InfoNCE 손실 함수를 채택하고, 웨이퍼 내 공간 위치가 공정 의미를 가진다는 도메인 지식을 반영한 grid36 structured local sampling과 HDBSCAN 밀도 기반 군집화를 결합하여 unknown defect 후보를 자동 탐지하고 전문가 검토 기반 라벨 확장 루프를 구성하였다.</w:t>
       </w:r>
     </w:p>
     <w:p>
@@ -262,7 +262,7 @@
           <w:i w:val="0"/>
           <w:sz w:val="20"/>
         </w:rPr>
-        <w:t>성능 향상의 실질적 경로는 두 단계로 정리된다. 첫 단계는 백본 선택과 하이퍼파라미터 최적화이다. EfficientNetV2, MaxViT, ViT, Swin Transformer 등을 Hugging Face timm 라이브러리를 통해 동일 조건에서 fine-tuning 비교하였다. 총 약 1500개(validation 약 500개) 규모의 데이터에서 self-attention 학습에 데이터가 부족한 ViT 계열보다, FCMAE 기반 비지도 사전학습 가중치와 384×384 입력 해상도를 지원하는 ConvNeXtV2-Base가 val F1 0.92로 1위를 기록하였다 [5]. 이후 Optuna 기반 하이퍼파라미터 탐색(LR, weight decay, scheduler, dropout, label smoothing, augmentation, batch size)까지 포함한 결과이다.</w:t>
+        <w:t>성능 향상의 실질적 경로는 두 단계로 정리된다. 첫 단계는 백본 선택과 하이퍼파라미터 최적화이다. EfficientNetV2, MaxViT, ViT, Swin Transformer 등을 Hugging Face timm 라이브러리를 통해 동일 조건에서 fine-tuning 비교하였다. 총 약 1500개(validation 약 500개) 규모의 데이터에서 self-attention 학습에 데이터가 부족한 ViT 계열보다, ConvNeXt V2에서 제안된 FCMAE (Fully Convolutional Masked Autoencoder) 기반 사전학습과 384×384 입력 해상도를 지원하는 ConvNeXtV2-Base가 더 적합하였다. 공식 결과에서도 ConvNeXt V2-Base 384 모델은 ImageNet-1K 기준 87.7% top-1 accuracy를 보고하며 [5], 본 연구의 backbone 비교에서도 val F1 0.92로 1위를 기록하였다. 이후 Optuna 기반 하이퍼파라미터 탐색(LR, weight decay, scheduler, dropout, label smoothing, augmentation, batch size)까지 포함한 결과이다.</w:t>
       </w:r>
     </w:p>
     <w:p>

</xml_diff>